<commit_message>
[PLAN-anthropics-skills-research] Bước 2.2: Áp dụng S1-S6 từ nghiên cứu anthropics/skills
- S1: Thêm name: frontmatter vào 7 file .claude/commands/*.md
- S2: Thêm frontmatter đầy đủ cho kztek-brand-info.md
- S3: Description "pushy" cho scope-check.md, skill-trigger-test.md, writing-agent-skill.md
- S4: Thêm mục Keywords cho kztek-brand-info.md, skill-trigger-test.md, writing-agent-skill.md
- S5: Thêm bước Agent Definition Testing (Reader Testing) vào writing-agent-skill.md
- S6: Thêm hướng dẫn Bundled Resources vào writing-agent-skill.md

User xác nhận trực tiếp áp dụng tất cả S1-S6 (2 lần qua AskUserQuestion).

Plan: .claude/plans/PLAN-anthropics-skills-research-2026-07-12.md
</commit_message>
<xml_diff>
--- a/.claude/commands/writing-agent-skill.docx
+++ b/.claude/commands/writing-agent-skill.docx
@@ -18,7 +18,74 @@
         <w:rPr>
           <w:sz w:val="21"/>
         </w:rPr>
-        <w:t>description: "Dùng khi muốn tạo agent/skill mới cho hệ thống KZTEK theo quy trình TDD-for-documentation — viết test scenario trước, verify agent hiện tại vi phạm (RED), viết định nghĩa agent/skill (GREEN), verify agent mới xử lý đúng, rồi tìm thêm edge case và vá (REFACTOR). KHÔNG dùng khi chỉ muốn sửa agent đã có (→ md-optimizer) hoặc kiểm tra trigger accuracy (→ skill-trigger-test)."</w:t>
+        <w:t>name: writing-agent-skill</w:t>
+      </w:r>
+    </w:p>
+    <w:p>
+      <w:pPr>
+        <w:spacing w:after="80"/>
+      </w:pPr>
+      <w:r>
+        <w:rPr>
+          <w:sz w:val="21"/>
+        </w:rPr>
+        <w:t xml:space="preserve">description: "PHẢI dùng khi: tạo agent/skill mới cho hệ thống KZTEK, cần viết </w:t>
+      </w:r>
+      <w:r>
+        <w:rPr>
+          <w:rFonts w:ascii="Courier New" w:hAnsi="Courier New"/>
+          <w:color w:val="F05922"/>
+          <w:sz w:val="18"/>
+        </w:rPr>
+        <w:t>.claude/agents/[name].md</w:t>
+      </w:r>
+      <w:r>
+        <w:rPr>
+          <w:sz w:val="21"/>
+        </w:rPr>
+        <w:t xml:space="preserve"> hoặc </w:t>
+      </w:r>
+      <w:r>
+        <w:rPr>
+          <w:rFonts w:ascii="Courier New" w:hAnsi="Courier New"/>
+          <w:color w:val="F05922"/>
+          <w:sz w:val="18"/>
+        </w:rPr>
+        <w:t>.claude/commands/[name].md</w:t>
+      </w:r>
+      <w:r>
+        <w:rPr>
+          <w:sz w:val="21"/>
+        </w:rPr>
+        <w:t xml:space="preserve"> từ đầu, muốn áp dụng quy trình TDD-for-documentation (RED viết test scenario xác nhận vi phạm → GREEN viết định nghĩa → REFACTOR tìm edge case), hoặc user nói 'tạo agent mới', 'viết skill mới', 'cần một agent để...'. KHÔNG dùng khi: chỉ muốn sửa/tối ưu agent đã có sẵn (→ </w:t>
+      </w:r>
+      <w:r>
+        <w:rPr>
+          <w:rFonts w:ascii="Courier New" w:hAnsi="Courier New"/>
+          <w:color w:val="F05922"/>
+          <w:sz w:val="18"/>
+        </w:rPr>
+        <w:t>md-optimizer</w:t>
+      </w:r>
+      <w:r>
+        <w:rPr>
+          <w:sz w:val="21"/>
+        </w:rPr>
+        <w:t xml:space="preserve">), chỉ cần kiểm tra trigger accuracy của agent/skill đã tồn tại (→ </w:t>
+      </w:r>
+      <w:r>
+        <w:rPr>
+          <w:rFonts w:ascii="Courier New" w:hAnsi="Courier New"/>
+          <w:color w:val="F05922"/>
+          <w:sz w:val="18"/>
+        </w:rPr>
+        <w:t>skill-trigger-test</w:t>
+      </w:r>
+      <w:r>
+        <w:rPr>
+          <w:sz w:val="21"/>
+        </w:rPr>
+        <w:t>), hoặc chỉ cần sửa nội dung body không liên quan đến quy trình tạo mới."</w:t>
       </w:r>
     </w:p>
     <w:p>
@@ -839,6 +906,446 @@
     </w:p>
     <w:p>
       <w:pPr>
+        <w:pStyle w:val="Heading3"/>
+        <w:spacing w:before="160" w:after="60"/>
+      </w:pPr>
+      <w:r>
+        <w:rPr>
+          <w:color w:val="4A3F8C"/>
+          <w:sz w:val="24"/>
+        </w:rPr>
+        <w:t>Bước 6 — Agent Definition Testing (Reader Testing)</w:t>
+      </w:r>
+    </w:p>
+    <w:p>
+      <w:pPr>
+        <w:spacing w:before="40" w:after="40"/>
+        <w:ind w:left="567"/>
+        <w:pBdr>
+          <w:left w:val="single" w:sz="12" w:space="10" w:color="F05922"/>
+        </w:pBdr>
+      </w:pPr>
+      <w:r>
+        <w:rPr>
+          <w:color w:val="4A3F8C"/>
+        </w:rPr>
+        <w:t xml:space="preserve">Học từ </w:t>
+      </w:r>
+      <w:r>
+        <w:rPr>
+          <w:rFonts w:ascii="Courier New" w:hAnsi="Courier New"/>
+          <w:color w:val="F05922"/>
+          <w:sz w:val="18"/>
+        </w:rPr>
+        <w:t>skills/doc-coauthoring/SKILL.md</w:t>
+      </w:r>
+      <w:r>
+        <w:rPr>
+          <w:color w:val="4A3F8C"/>
+        </w:rPr>
+        <w:t xml:space="preserve"> (anthropics/skills) — Stage 3 "Reader Testing": test tài liệu với người đọc chưa có context, KHÔNG phải người đã viết ra nó.</w:t>
+      </w:r>
+    </w:p>
+    <w:p>
+      <w:pPr>
+        <w:spacing w:after="80"/>
+      </w:pPr>
+      <w:r>
+        <w:rPr>
+          <w:sz w:val="21"/>
+        </w:rPr>
+        <w:t xml:space="preserve">Vấn đề: agent/skill được viết trong session hiện tại — người viết (bạn) có toàn bộ context của cuộc hội thoại dẫn đến quyết định đó. Nhưng khi agent/skill này được gọi thật sự sau này, agent nhận nó sẽ đọc file </w:t>
+      </w:r>
+      <w:r>
+        <w:rPr>
+          <w:b/>
+          <w:sz w:val="21"/>
+        </w:rPr>
+        <w:t>hoàn toàn không có context session gốc</w:t>
+      </w:r>
+      <w:r>
+        <w:rPr>
+          <w:sz w:val="21"/>
+        </w:rPr>
+        <w:t xml:space="preserve"> ("cold read"). Một definition "rõ ràng" với người vừa viết ra có thể mơ hồ/thiếu sót với agent đọc lần đầu.</w:t>
+      </w:r>
+    </w:p>
+    <w:p>
+      <w:pPr>
+        <w:spacing w:after="80"/>
+      </w:pPr>
+      <w:r>
+        <w:rPr>
+          <w:sz w:val="21"/>
+        </w:rPr>
+        <w:t>Quy trình:</w:t>
+      </w:r>
+    </w:p>
+    <w:p>
+      <w:pPr>
+        <w:spacing w:after="20"/>
+        <w:ind w:left="567" w:hanging="283"/>
+      </w:pPr>
+      <w:r>
+        <w:rPr>
+          <w:sz w:val="21"/>
+        </w:rPr>
+        <w:t>1.</w:t>
+        <w:tab/>
+      </w:r>
+      <w:r>
+        <w:rPr>
+          <w:sz w:val="21"/>
+        </w:rPr>
+        <w:t xml:space="preserve">Sau khi hoàn thành Bước 4 (GREEN verify) và Bước 5 (REFACTOR), spawn </w:t>
+      </w:r>
+      <w:r>
+        <w:rPr>
+          <w:b/>
+          <w:sz w:val="21"/>
+        </w:rPr>
+        <w:t>1 subagent mới, chỉ đưa cho nó file định nghĩa vừa viết</w:t>
+      </w:r>
+      <w:r>
+        <w:rPr>
+          <w:sz w:val="21"/>
+        </w:rPr>
+        <w:t xml:space="preserve"> (</w:t>
+      </w:r>
+      <w:r>
+        <w:rPr>
+          <w:rFonts w:ascii="Courier New" w:hAnsi="Courier New"/>
+          <w:color w:val="F05922"/>
+          <w:sz w:val="21"/>
+        </w:rPr>
+        <w:t>.claude/agents/[name].md</w:t>
+      </w:r>
+      <w:r>
+        <w:rPr>
+          <w:sz w:val="21"/>
+        </w:rPr>
+        <w:t xml:space="preserve"> hoặc </w:t>
+      </w:r>
+      <w:r>
+        <w:rPr>
+          <w:rFonts w:ascii="Courier New" w:hAnsi="Courier New"/>
+          <w:color w:val="F05922"/>
+          <w:sz w:val="21"/>
+        </w:rPr>
+        <w:t>.claude/commands/[name].md</w:t>
+      </w:r>
+      <w:r>
+        <w:rPr>
+          <w:sz w:val="21"/>
+        </w:rPr>
+        <w:t>) — KHÔNG kèm theo lịch sử hội thoại, KHÔNG giải thích thêm ngoài nội dung file.</w:t>
+      </w:r>
+    </w:p>
+    <w:p>
+      <w:pPr>
+        <w:spacing w:after="20"/>
+        <w:ind w:left="567" w:hanging="283"/>
+      </w:pPr>
+      <w:r>
+        <w:rPr>
+          <w:sz w:val="21"/>
+        </w:rPr>
+        <w:t>2.</w:t>
+        <w:tab/>
+      </w:r>
+      <w:r>
+        <w:rPr>
+          <w:sz w:val="21"/>
+        </w:rPr>
+        <w:t>Yêu cầu subagent đó tự chạy lại các Test Scenarios (Capability Eval) từ Bước 2, chỉ dựa vào những gì đọc được trong file.</w:t>
+      </w:r>
+    </w:p>
+    <w:p>
+      <w:pPr>
+        <w:spacing w:after="20"/>
+        <w:ind w:left="567" w:hanging="283"/>
+      </w:pPr>
+      <w:r>
+        <w:rPr>
+          <w:sz w:val="21"/>
+        </w:rPr>
+        <w:t>3.</w:t>
+        <w:tab/>
+      </w:r>
+      <w:r>
+        <w:rPr>
+          <w:sz w:val="21"/>
+        </w:rPr>
+        <w:t>Ghi nhận kết quả: subagent có hiểu đúng khi nào trigger không? Có bỏ sót near-miss case nào description chưa liệt kê không? Có bước nào trong quy trình mà subagent hiểu sai ý đồ không?</w:t>
+      </w:r>
+    </w:p>
+    <w:p>
+      <w:pPr>
+        <w:spacing w:after="20"/>
+        <w:ind w:left="567" w:hanging="283"/>
+      </w:pPr>
+      <w:r>
+        <w:rPr>
+          <w:sz w:val="21"/>
+        </w:rPr>
+        <w:t>4.</w:t>
+        <w:tab/>
+      </w:r>
+      <w:r>
+        <w:rPr>
+          <w:sz w:val="21"/>
+        </w:rPr>
+        <w:t>Nếu subagent "cold read" xử lý sai/hiểu nhầm bất kỳ điểm nào → đây là blind spot thật sự (không phải giả định) → quay lại Bước 3 sửa definition, KHÔNG tự cho là "chắc nó sẽ hiểu".</w:t>
+      </w:r>
+    </w:p>
+    <w:p>
+      <w:pPr>
+        <w:spacing w:after="20"/>
+        <w:ind w:left="567" w:hanging="283"/>
+      </w:pPr>
+      <w:r>
+        <w:rPr>
+          <w:sz w:val="21"/>
+        </w:rPr>
+        <w:t>5.</w:t>
+        <w:tab/>
+      </w:r>
+      <w:r>
+        <w:rPr>
+          <w:sz w:val="21"/>
+        </w:rPr>
+        <w:t>Chỉ đánh dấu agent/skill "APPROVED" sau khi Reader Testing pass — khớp yêu cầu Eval-Driven Development (§18.5 CLAUDE.md): ≥ 2/3 Capability Eval phải pass qua cold-read thật, không phải suy luận của người viết.</w:t>
+      </w:r>
+    </w:p>
+    <w:p>
+      <w:pPr>
+        <w:pBdr>
+          <w:bottom w:val="single" w:sz="6" w:space="1" w:color="F05922"/>
+        </w:pBdr>
+        <w:spacing w:after="120"/>
+      </w:pPr>
+    </w:p>
+    <w:p>
+      <w:pPr>
+        <w:pStyle w:val="Heading2"/>
+        <w:spacing w:before="200" w:after="80"/>
+      </w:pPr>
+      <w:r>
+        <w:rPr>
+          <w:color w:val="F05922"/>
+          <w:sz w:val="28"/>
+        </w:rPr>
+        <w:t>Khi nào nên dùng Bundled Resources (scripts/references/assets)</w:t>
+      </w:r>
+    </w:p>
+    <w:p>
+      <w:pPr>
+        <w:spacing w:before="40" w:after="40"/>
+        <w:ind w:left="567"/>
+        <w:pBdr>
+          <w:left w:val="single" w:sz="12" w:space="10" w:color="F05922"/>
+        </w:pBdr>
+      </w:pPr>
+      <w:r>
+        <w:rPr>
+          <w:color w:val="4A3F8C"/>
+        </w:rPr>
+        <w:t xml:space="preserve">Học từ </w:t>
+      </w:r>
+      <w:r>
+        <w:rPr>
+          <w:rFonts w:ascii="Courier New" w:hAnsi="Courier New"/>
+          <w:color w:val="F05922"/>
+          <w:sz w:val="18"/>
+        </w:rPr>
+        <w:t>skill-creator/SKILL.md</w:t>
+      </w:r>
+      <w:r>
+        <w:rPr>
+          <w:color w:val="4A3F8C"/>
+        </w:rPr>
+        <w:t xml:space="preserve"> (anthropics/skills) — "Anatomy of a Skill": skill phức tạp nên tách nội dung ra ngoài file chính thay vì nhồi hết vào 1 file, để tránh tốn context khi mọi phần đều bị load dù agent chỉ cần một phần nhỏ.</w:t>
+      </w:r>
+    </w:p>
+    <w:p>
+      <w:pPr>
+        <w:spacing w:after="80"/>
+      </w:pPr>
+      <w:r>
+        <w:rPr>
+          <w:sz w:val="21"/>
+        </w:rPr>
+        <w:t xml:space="preserve">Đa số skill/agent của KZTEK là single-file và nên </w:t>
+      </w:r>
+      <w:r>
+        <w:rPr>
+          <w:b/>
+          <w:sz w:val="21"/>
+        </w:rPr>
+        <w:t>giữ nguyên single-file</w:t>
+      </w:r>
+      <w:r>
+        <w:rPr>
+          <w:sz w:val="21"/>
+        </w:rPr>
+        <w:t xml:space="preserve"> — chỉ tách khi có ít nhất 1 trong 3 tín hiệu sau:</w:t>
+      </w:r>
+    </w:p>
+    <w:p>
+      <w:pPr>
+        <w:spacing w:after="20"/>
+        <w:ind w:left="567" w:hanging="283"/>
+      </w:pPr>
+      <w:r>
+        <w:rPr>
+          <w:sz w:val="21"/>
+        </w:rPr>
+        <w:t>1.</w:t>
+        <w:tab/>
+      </w:r>
+      <w:r>
+        <w:rPr>
+          <w:b/>
+          <w:sz w:val="21"/>
+        </w:rPr>
+        <w:t>Nội dung tham chiếu dài, ít khi cần đọc hết</w:t>
+      </w:r>
+      <w:r>
+        <w:rPr>
+          <w:sz w:val="21"/>
+        </w:rPr>
+        <w:t xml:space="preserve"> — VD: bảng tra cứu mã lỗi đầy đủ, danh sách API contract chi tiết mà agent chỉ cần tra 1-2 dòng mỗi lần dùng → tách vào </w:t>
+      </w:r>
+      <w:r>
+        <w:rPr>
+          <w:rFonts w:ascii="Courier New" w:hAnsi="Courier New"/>
+          <w:color w:val="F05922"/>
+          <w:sz w:val="21"/>
+        </w:rPr>
+        <w:t>references/*.md</w:t>
+      </w:r>
+      <w:r>
+        <w:rPr>
+          <w:sz w:val="21"/>
+        </w:rPr>
+        <w:t>, file chính chỉ trỏ đường dẫn.</w:t>
+      </w:r>
+    </w:p>
+    <w:p>
+      <w:pPr>
+        <w:spacing w:after="20"/>
+        <w:ind w:left="567" w:hanging="283"/>
+      </w:pPr>
+      <w:r>
+        <w:rPr>
+          <w:sz w:val="21"/>
+        </w:rPr>
+        <w:t>2.</w:t>
+        <w:tab/>
+      </w:r>
+      <w:r>
+        <w:rPr>
+          <w:b/>
+          <w:sz w:val="21"/>
+        </w:rPr>
+        <w:t>Có đoạn logic/thao tác lặp lại y hệt mỗi lần chạy, không cần LLM "suy nghĩ" lại</w:t>
+      </w:r>
+      <w:r>
+        <w:rPr>
+          <w:sz w:val="21"/>
+        </w:rPr>
+        <w:t xml:space="preserve"> — VD: script chuyển đổi định dạng, script kiểm tra checklist cố định → tách thành </w:t>
+      </w:r>
+      <w:r>
+        <w:rPr>
+          <w:rFonts w:ascii="Courier New" w:hAnsi="Courier New"/>
+          <w:color w:val="F05922"/>
+          <w:sz w:val="21"/>
+        </w:rPr>
+        <w:t>scripts/*.py</w:t>
+      </w:r>
+      <w:r>
+        <w:rPr>
+          <w:sz w:val="21"/>
+        </w:rPr>
+        <w:t xml:space="preserve"> hoặc </w:t>
+      </w:r>
+      <w:r>
+        <w:rPr>
+          <w:rFonts w:ascii="Courier New" w:hAnsi="Courier New"/>
+          <w:color w:val="F05922"/>
+          <w:sz w:val="21"/>
+        </w:rPr>
+        <w:t>.sh</w:t>
+      </w:r>
+      <w:r>
+        <w:rPr>
+          <w:sz w:val="21"/>
+        </w:rPr>
+        <w:t xml:space="preserve"> để agent GỌI trực tiếp (black-box), không cần nhồi toàn bộ code vào context.</w:t>
+      </w:r>
+    </w:p>
+    <w:p>
+      <w:pPr>
+        <w:spacing w:after="20"/>
+        <w:ind w:left="567" w:hanging="283"/>
+      </w:pPr>
+      <w:r>
+        <w:rPr>
+          <w:sz w:val="21"/>
+        </w:rPr>
+        <w:t>3.</w:t>
+        <w:tab/>
+      </w:r>
+      <w:r>
+        <w:rPr>
+          <w:b/>
+          <w:sz w:val="21"/>
+        </w:rPr>
+        <w:t>Có asset nhị phân/template cố định dùng lặp lại</w:t>
+      </w:r>
+      <w:r>
+        <w:rPr>
+          <w:sz w:val="21"/>
+        </w:rPr>
+        <w:t xml:space="preserve"> — VD: logo, template DOCX, ảnh mẫu → để trong </w:t>
+      </w:r>
+      <w:r>
+        <w:rPr>
+          <w:rFonts w:ascii="Courier New" w:hAnsi="Courier New"/>
+          <w:color w:val="F05922"/>
+          <w:sz w:val="21"/>
+        </w:rPr>
+        <w:t>assets/</w:t>
+      </w:r>
+      <w:r>
+        <w:rPr>
+          <w:sz w:val="21"/>
+        </w:rPr>
+        <w:t>, file chính chỉ mô tả cách dùng.</w:t>
+      </w:r>
+    </w:p>
+    <w:p>
+      <w:pPr>
+        <w:spacing w:after="80"/>
+      </w:pPr>
+      <w:r>
+        <w:rPr>
+          <w:sz w:val="21"/>
+        </w:rPr>
+        <w:t>Nếu KHÔNG có tín hiệu nào ở trên → giữ single-file, không tạo cấu trúc thư mục phụ không cần thiết (tránh over-engineering cho skill đơn giản).</w:t>
+      </w:r>
+    </w:p>
+    <w:p>
+      <w:pPr>
+        <w:pBdr>
+          <w:bottom w:val="single" w:sz="6" w:space="1" w:color="F05922"/>
+        </w:pBdr>
+        <w:spacing w:after="120"/>
+      </w:pPr>
+    </w:p>
+    <w:p>
+      <w:pPr>
         <w:pStyle w:val="Heading2"/>
         <w:spacing w:before="200" w:after="80"/>
       </w:pPr>
@@ -941,6 +1448,19 @@
           <w:sz w:val="21"/>
         </w:rPr>
         <w:t>[ ] Tất cả test scenarios từ Bước 2 đã Pass ở Bước 4</w:t>
+      </w:r>
+    </w:p>
+    <w:p>
+      <w:pPr>
+        <w:pStyle w:val="ListBullet"/>
+        <w:spacing w:after="20"/>
+        <w:ind w:left="283"/>
+      </w:pPr>
+      <w:r>
+        <w:rPr>
+          <w:sz w:val="21"/>
+        </w:rPr>
+        <w:t>[ ] Đã chạy Bước 6 — Agent Definition Testing (cold-read qua subagent mới, không có context session)</w:t>
       </w:r>
     </w:p>
     <w:p>
@@ -1129,6 +1649,38 @@
           <w:sz w:val="21"/>
         </w:rPr>
         <w:t xml:space="preserve"> "Build chạy trong đầu rồi, paste output làm gì mất thời gian" → thêm vào Red Flags.</w:t>
+      </w:r>
+    </w:p>
+    <w:p>
+      <w:pPr>
+        <w:pBdr>
+          <w:bottom w:val="single" w:sz="6" w:space="1" w:color="F05922"/>
+        </w:pBdr>
+        <w:spacing w:after="120"/>
+      </w:pPr>
+    </w:p>
+    <w:p>
+      <w:pPr>
+        <w:pStyle w:val="Heading2"/>
+        <w:spacing w:before="200" w:after="80"/>
+      </w:pPr>
+      <w:r>
+        <w:rPr>
+          <w:color w:val="F05922"/>
+          <w:sz w:val="28"/>
+        </w:rPr>
+        <w:t>Keywords</w:t>
+      </w:r>
+    </w:p>
+    <w:p>
+      <w:pPr>
+        <w:spacing w:after="80"/>
+      </w:pPr>
+      <w:r>
+        <w:rPr>
+          <w:sz w:val="21"/>
+        </w:rPr>
+        <w:t>tạo agent mới, viết skill mới, TDD-for-documentation, RED GREEN REFACTOR, test scenario, capability eval, agent definition, skill definition, Reader Testing, cold read, bundled resources, agent introspection, viết định nghĩa agent, viết định nghĩa skill, EDD Eval-Driven Development</w:t>
       </w:r>
     </w:p>
     <w:sectPr>

</xml_diff>